<commit_message>
Added description to README
</commit_message>
<xml_diff>
--- a/new-git-project/git-commands-documentation.docx
+++ b/new-git-project/git-commands-documentation.docx
@@ -13,13 +13,41 @@
       </w:pPr>
       <w:bookmarkStart w:id="0" w:name="_oe92ef9ki98r" w:colFirst="0" w:colLast="0"/>
       <w:bookmarkEnd w:id="0"/>
+      <w:proofErr w:type="spellStart"/>
       <w:r>
         <w:rPr>
           <w:rFonts w:ascii="Open Sans" w:eastAsia="Open Sans" w:hAnsi="Open Sans" w:cs="Open Sans"/>
           <w:color w:val="2105FF"/>
           <w:lang w:val="fr-FR"/>
         </w:rPr>
-        <w:t>Github Project: Git Commands Documentation Template</w:t>
+        <w:t>Github</w:t>
+      </w:r>
+      <w:proofErr w:type="spellEnd"/>
+      <w:r>
+        <w:rPr>
+          <w:rFonts w:ascii="Open Sans" w:eastAsia="Open Sans" w:hAnsi="Open Sans" w:cs="Open Sans"/>
+          <w:color w:val="2105FF"/>
+          <w:lang w:val="fr-FR"/>
+        </w:rPr>
+        <w:t xml:space="preserve"> Project: Git </w:t>
+      </w:r>
+      <w:proofErr w:type="spellStart"/>
+      <w:r>
+        <w:rPr>
+          <w:rFonts w:ascii="Open Sans" w:eastAsia="Open Sans" w:hAnsi="Open Sans" w:cs="Open Sans"/>
+          <w:color w:val="2105FF"/>
+          <w:lang w:val="fr-FR"/>
+        </w:rPr>
+        <w:t>Commands</w:t>
+      </w:r>
+      <w:proofErr w:type="spellEnd"/>
+      <w:r>
+        <w:rPr>
+          <w:rFonts w:ascii="Open Sans" w:eastAsia="Open Sans" w:hAnsi="Open Sans" w:cs="Open Sans"/>
+          <w:color w:val="2105FF"/>
+          <w:lang w:val="fr-FR"/>
+        </w:rPr>
+        <w:t xml:space="preserve"> Documentation Template</w:t>
       </w:r>
     </w:p>
     <w:p>
@@ -694,7 +722,21 @@
               <w:rPr>
                 <w:rFonts w:ascii="Open Sans" w:eastAsia="Open Sans" w:hAnsi="Open Sans" w:cs="Open Sans"/>
               </w:rPr>
-              <w:t>Create a .gitignore file containing the name of your data file.</w:t>
+              <w:t>Create a .</w:t>
+            </w:r>
+            <w:proofErr w:type="spellStart"/>
+            <w:r>
+              <w:rPr>
+                <w:rFonts w:ascii="Open Sans" w:eastAsia="Open Sans" w:hAnsi="Open Sans" w:cs="Open Sans"/>
+              </w:rPr>
+              <w:t>gitignore</w:t>
+            </w:r>
+            <w:proofErr w:type="spellEnd"/>
+            <w:r>
+              <w:rPr>
+                <w:rFonts w:ascii="Open Sans" w:eastAsia="Open Sans" w:hAnsi="Open Sans" w:cs="Open Sans"/>
+              </w:rPr>
+              <w:t xml:space="preserve"> file containing the name of your data file.</w:t>
             </w:r>
           </w:p>
         </w:tc>
@@ -719,8 +761,16 @@
               <w:rPr>
                 <w:rFonts w:ascii="Open Sans" w:eastAsia="Open Sans" w:hAnsi="Open Sans" w:cs="Open Sans"/>
               </w:rPr>
-              <w:t>echo "new_york_city.csv" &gt;&gt; .gitignore</w:t>
-            </w:r>
+              <w:t>echo "new_york_city.csv" &gt;&gt; .</w:t>
+            </w:r>
+            <w:proofErr w:type="spellStart"/>
+            <w:r>
+              <w:rPr>
+                <w:rFonts w:ascii="Open Sans" w:eastAsia="Open Sans" w:hAnsi="Open Sans" w:cs="Open Sans"/>
+              </w:rPr>
+              <w:t>gitignore</w:t>
+            </w:r>
+            <w:proofErr w:type="spellEnd"/>
           </w:p>
         </w:tc>
       </w:tr>
@@ -771,8 +821,16 @@
               <w:rPr>
                 <w:rFonts w:ascii="Open Sans" w:eastAsia="Open Sans" w:hAnsi="Open Sans" w:cs="Open Sans"/>
               </w:rPr>
-              <w:t>List the file names associated with the data files you added to your .gitignore</w:t>
-            </w:r>
+              <w:t>List the file names associated with the data files you added to your .</w:t>
+            </w:r>
+            <w:proofErr w:type="spellStart"/>
+            <w:r>
+              <w:rPr>
+                <w:rFonts w:ascii="Open Sans" w:eastAsia="Open Sans" w:hAnsi="Open Sans" w:cs="Open Sans"/>
+              </w:rPr>
+              <w:t>gitignore</w:t>
+            </w:r>
+            <w:proofErr w:type="spellEnd"/>
           </w:p>
         </w:tc>
         <w:tc>
@@ -796,8 +854,16 @@
               <w:rPr>
                 <w:rFonts w:ascii="Open Sans" w:eastAsia="Open Sans" w:hAnsi="Open Sans" w:cs="Open Sans"/>
               </w:rPr>
-              <w:t>cat .gitignore</w:t>
-            </w:r>
+              <w:t>cat .</w:t>
+            </w:r>
+            <w:proofErr w:type="spellStart"/>
+            <w:r>
+              <w:rPr>
+                <w:rFonts w:ascii="Open Sans" w:eastAsia="Open Sans" w:hAnsi="Open Sans" w:cs="Open Sans"/>
+              </w:rPr>
+              <w:t>gitignore</w:t>
+            </w:r>
+            <w:proofErr w:type="spellEnd"/>
           </w:p>
         </w:tc>
       </w:tr>
@@ -1025,7 +1091,21 @@
               <w:rPr>
                 <w:rFonts w:ascii="Open Sans" w:eastAsia="Open Sans" w:hAnsi="Open Sans" w:cs="Open Sans"/>
               </w:rPr>
-              <w:t>git commit -m "Add bikeshare analysis script and configure gitignore for data files"</w:t>
+              <w:t xml:space="preserve">git commit -m "Add bikeshare analysis script and configure </w:t>
+            </w:r>
+            <w:proofErr w:type="spellStart"/>
+            <w:r>
+              <w:rPr>
+                <w:rFonts w:ascii="Open Sans" w:eastAsia="Open Sans" w:hAnsi="Open Sans" w:cs="Open Sans"/>
+              </w:rPr>
+              <w:t>gitignore</w:t>
+            </w:r>
+            <w:proofErr w:type="spellEnd"/>
+            <w:r>
+              <w:rPr>
+                <w:rFonts w:ascii="Open Sans" w:eastAsia="Open Sans" w:hAnsi="Open Sans" w:cs="Open Sans"/>
+              </w:rPr>
+              <w:t xml:space="preserve"> for data files"</w:t>
             </w:r>
           </w:p>
         </w:tc>
@@ -1137,7 +1217,23 @@
           <w:rFonts w:ascii="Open Sans" w:eastAsia="Open Sans" w:hAnsi="Open Sans" w:cs="Open Sans"/>
           <w:b/>
         </w:rPr>
-        <w:t xml:space="preserve">Now you will be working in your local repository, on the BikeShare code file and the README.md file. You should repeat steps </w:t>
+        <w:t xml:space="preserve">Now you will be working in your local repository, on the </w:t>
+      </w:r>
+      <w:proofErr w:type="spellStart"/>
+      <w:r>
+        <w:rPr>
+          <w:rFonts w:ascii="Open Sans" w:eastAsia="Open Sans" w:hAnsi="Open Sans" w:cs="Open Sans"/>
+          <w:b/>
+        </w:rPr>
+        <w:t>BikeShare</w:t>
+      </w:r>
+      <w:proofErr w:type="spellEnd"/>
+      <w:r>
+        <w:rPr>
+          <w:rFonts w:ascii="Open Sans" w:eastAsia="Open Sans" w:hAnsi="Open Sans" w:cs="Open Sans"/>
+          <w:b/>
+        </w:rPr>
+        <w:t xml:space="preserve"> code file and the README.md file. You should repeat steps </w:t>
       </w:r>
       <w:r>
         <w:rPr>
@@ -1380,6 +1476,12 @@
                 <w:rFonts w:ascii="Open Sans" w:eastAsia="Open Sans" w:hAnsi="Open Sans" w:cs="Open Sans"/>
               </w:rPr>
             </w:pPr>
+            <w:r>
+              <w:rPr>
+                <w:rFonts w:ascii="Open Sans" w:eastAsia="Open Sans" w:hAnsi="Open Sans" w:cs="Open Sans"/>
+              </w:rPr>
+              <w:t>git branch new-git-project</w:t>
+            </w:r>
           </w:p>
         </w:tc>
       </w:tr>
@@ -1465,6 +1567,48 @@
                 <w:rFonts w:ascii="Open Sans" w:eastAsia="Open Sans" w:hAnsi="Open Sans" w:cs="Open Sans"/>
               </w:rPr>
             </w:pPr>
+            <w:r>
+              <w:rPr>
+                <w:rFonts w:ascii="Open Sans" w:eastAsia="Open Sans" w:hAnsi="Open Sans" w:cs="Open Sans"/>
+              </w:rPr>
+              <w:t>git checkout</w:t>
+            </w:r>
+            <w:r>
+              <w:rPr>
+                <w:rFonts w:ascii="Open Sans" w:eastAsia="Open Sans" w:hAnsi="Open Sans" w:cs="Open Sans"/>
+              </w:rPr>
+              <w:t xml:space="preserve"> </w:t>
+            </w:r>
+            <w:r>
+              <w:rPr>
+                <w:rFonts w:ascii="Open Sans" w:eastAsia="Open Sans" w:hAnsi="Open Sans" w:cs="Open Sans"/>
+              </w:rPr>
+              <w:t>new-git-project</w:t>
+            </w:r>
+            <w:r>
+              <w:rPr>
+                <w:rFonts w:ascii="Open Sans" w:eastAsia="Open Sans" w:hAnsi="Open Sans" w:cs="Open Sans"/>
+              </w:rPr>
+              <w:br/>
+            </w:r>
+            <w:r>
+              <w:rPr>
+                <w:rFonts w:ascii="Open Sans" w:eastAsia="Open Sans" w:hAnsi="Open Sans" w:cs="Open Sans"/>
+              </w:rPr>
+              <w:t>git switch</w:t>
+            </w:r>
+            <w:r>
+              <w:rPr>
+                <w:rFonts w:ascii="Open Sans" w:eastAsia="Open Sans" w:hAnsi="Open Sans" w:cs="Open Sans"/>
+              </w:rPr>
+              <w:t xml:space="preserve"> </w:t>
+            </w:r>
+            <w:r>
+              <w:rPr>
+                <w:rFonts w:ascii="Open Sans" w:eastAsia="Open Sans" w:hAnsi="Open Sans" w:cs="Open Sans"/>
+              </w:rPr>
+              <w:t>new-git-project</w:t>
+            </w:r>
           </w:p>
         </w:tc>
       </w:tr>
@@ -1541,7 +1685,7 @@
                 <w:rFonts w:ascii="Open Sans" w:eastAsia="Open Sans" w:hAnsi="Open Sans" w:cs="Open Sans"/>
                 <w:b/>
               </w:rPr>
-              <w:t>No git command needed (edit the text in your README.md file)</w:t>
+              <w:t>nano README.md</w:t>
             </w:r>
           </w:p>
         </w:tc>
@@ -1613,6 +1757,12 @@
                 <w:rFonts w:ascii="Open Sans" w:eastAsia="Open Sans" w:hAnsi="Open Sans" w:cs="Open Sans"/>
               </w:rPr>
             </w:pPr>
+            <w:r>
+              <w:rPr>
+                <w:rFonts w:ascii="Open Sans" w:eastAsia="Open Sans" w:hAnsi="Open Sans" w:cs="Open Sans"/>
+              </w:rPr>
+              <w:t>git add README.md</w:t>
+            </w:r>
           </w:p>
         </w:tc>
       </w:tr>
@@ -1683,6 +1833,24 @@
                 <w:rFonts w:ascii="Open Sans" w:eastAsia="Open Sans" w:hAnsi="Open Sans" w:cs="Open Sans"/>
               </w:rPr>
             </w:pPr>
+            <w:r>
+              <w:rPr>
+                <w:rFonts w:ascii="Open Sans" w:eastAsia="Open Sans" w:hAnsi="Open Sans" w:cs="Open Sans"/>
+              </w:rPr>
+              <w:t>git commit -m "Add</w:t>
+            </w:r>
+            <w:r>
+              <w:rPr>
+                <w:rFonts w:ascii="Open Sans" w:eastAsia="Open Sans" w:hAnsi="Open Sans" w:cs="Open Sans"/>
+              </w:rPr>
+              <w:t xml:space="preserve">ed </w:t>
+            </w:r>
+            <w:r>
+              <w:rPr>
+                <w:rFonts w:ascii="Open Sans" w:eastAsia="Open Sans" w:hAnsi="Open Sans" w:cs="Open Sans"/>
+              </w:rPr>
+              <w:t>description to README"</w:t>
+            </w:r>
           </w:p>
         </w:tc>
       </w:tr>
@@ -1753,6 +1921,12 @@
                 <w:rFonts w:ascii="Open Sans" w:eastAsia="Open Sans" w:hAnsi="Open Sans" w:cs="Open Sans"/>
               </w:rPr>
             </w:pPr>
+            <w:r>
+              <w:rPr>
+                <w:rFonts w:ascii="Open Sans" w:eastAsia="Open Sans" w:hAnsi="Open Sans" w:cs="Open Sans"/>
+              </w:rPr>
+              <w:t>git push origin documentation</w:t>
+            </w:r>
           </w:p>
         </w:tc>
       </w:tr>
@@ -1828,6 +2002,12 @@
                 <w:rFonts w:ascii="Open Sans" w:eastAsia="Open Sans" w:hAnsi="Open Sans" w:cs="Open Sans"/>
               </w:rPr>
             </w:pPr>
+            <w:r>
+              <w:rPr>
+                <w:rFonts w:ascii="Open Sans" w:eastAsia="Open Sans" w:hAnsi="Open Sans" w:cs="Open Sans"/>
+              </w:rPr>
+              <w:t>git switch master</w:t>
+            </w:r>
           </w:p>
         </w:tc>
       </w:tr>
@@ -2589,7 +2769,21 @@
               <w:rPr>
                 <w:rFonts w:ascii="Open Sans" w:eastAsia="Open Sans" w:hAnsi="Open Sans" w:cs="Open Sans"/>
               </w:rPr>
-              <w:t>Go to Github.  Notice that you now have two branches available for your project, and when you change branches the README changes.</w:t>
+              <w:t xml:space="preserve">Go to </w:t>
+            </w:r>
+            <w:proofErr w:type="spellStart"/>
+            <w:r>
+              <w:rPr>
+                <w:rFonts w:ascii="Open Sans" w:eastAsia="Open Sans" w:hAnsi="Open Sans" w:cs="Open Sans"/>
+              </w:rPr>
+              <w:t>Github</w:t>
+            </w:r>
+            <w:proofErr w:type="spellEnd"/>
+            <w:r>
+              <w:rPr>
+                <w:rFonts w:ascii="Open Sans" w:eastAsia="Open Sans" w:hAnsi="Open Sans" w:cs="Open Sans"/>
+              </w:rPr>
+              <w:t>.  Notice that you now have two branches available for your project, and when you change branches the README changes.</w:t>
             </w:r>
           </w:p>
         </w:tc>
@@ -4353,7 +4547,6 @@
               <v:path gradientshapeok="t" o:connecttype="rect"/>
             </v:shapetype>
             <v:shape id="Text Box 2" o:spid="_x0000_s1026" type="#_x0000_t202" alt="INTERNAL" style="position:absolute;margin-left:0;margin-top:0;width:59.6pt;height:25.6pt;z-index:251659264;visibility:visible;mso-wrap-style:none;mso-wrap-distance-left:0;mso-wrap-distance-top:0;mso-wrap-distance-right:0;mso-wrap-distance-bottom:0;mso-position-horizontal:left;mso-position-horizontal-relative:page;mso-position-vertical:bottom;mso-position-vertical-relative:page;v-text-anchor:bottom" o:gfxdata="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" filled="f" stroked="f">
-              <v:fill o:detectmouseclick="t"/>
               <v:textbox style="mso-fit-shape-to-text:t" inset="20pt,0,0,15pt">
                 <w:txbxContent>
                   <w:p>
@@ -4478,7 +4671,6 @@
               <v:path gradientshapeok="t" o:connecttype="rect"/>
             </v:shapetype>
             <v:shape id="Text Box 3" o:spid="_x0000_s1027" type="#_x0000_t202" alt="INTERNAL" style="position:absolute;margin-left:0;margin-top:0;width:59.6pt;height:25.6pt;z-index:251660288;visibility:visible;mso-wrap-style:none;mso-wrap-distance-left:0;mso-wrap-distance-top:0;mso-wrap-distance-right:0;mso-wrap-distance-bottom:0;mso-position-horizontal:left;mso-position-horizontal-relative:page;mso-position-vertical:bottom;mso-position-vertical-relative:page;v-text-anchor:bottom" o:gfxdata="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" filled="f" stroked="f">
-              <v:fill o:detectmouseclick="t"/>
               <v:textbox style="mso-fit-shape-to-text:t" inset="20pt,0,0,15pt">
                 <w:txbxContent>
                   <w:p>
@@ -4603,7 +4795,6 @@
               <v:path gradientshapeok="t" o:connecttype="rect"/>
             </v:shapetype>
             <v:shape id="Text Box 1" o:spid="_x0000_s1028" type="#_x0000_t202" alt="INTERNAL" style="position:absolute;margin-left:0;margin-top:0;width:59.6pt;height:25.6pt;z-index:251658240;visibility:visible;mso-wrap-style:none;mso-wrap-distance-left:0;mso-wrap-distance-top:0;mso-wrap-distance-right:0;mso-wrap-distance-bottom:0;mso-position-horizontal:left;mso-position-horizontal-relative:page;mso-position-vertical:bottom;mso-position-vertical-relative:page;v-text-anchor:bottom" o:gfxdata="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" filled="f" stroked="f">
-              <v:fill o:detectmouseclick="t"/>
               <v:textbox style="mso-fit-shape-to-text:t" inset="20pt,0,0,15pt">
                 <w:txbxContent>
                   <w:p>

</xml_diff>

<commit_message>
Add inline comments to README
</commit_message>
<xml_diff>
--- a/new-git-project/git-commands-documentation.docx
+++ b/new-git-project/git-commands-documentation.docx
@@ -13,41 +13,13 @@
       </w:pPr>
       <w:bookmarkStart w:id="0" w:name="_oe92ef9ki98r" w:colFirst="0" w:colLast="0"/>
       <w:bookmarkEnd w:id="0"/>
-      <w:proofErr w:type="spellStart"/>
       <w:r>
         <w:rPr>
           <w:rFonts w:ascii="Open Sans" w:eastAsia="Open Sans" w:hAnsi="Open Sans" w:cs="Open Sans"/>
           <w:color w:val="2105FF"/>
           <w:lang w:val="fr-FR"/>
         </w:rPr>
-        <w:t>Github</w:t>
-      </w:r>
-      <w:proofErr w:type="spellEnd"/>
-      <w:r>
-        <w:rPr>
-          <w:rFonts w:ascii="Open Sans" w:eastAsia="Open Sans" w:hAnsi="Open Sans" w:cs="Open Sans"/>
-          <w:color w:val="2105FF"/>
-          <w:lang w:val="fr-FR"/>
-        </w:rPr>
-        <w:t xml:space="preserve"> Project: Git </w:t>
-      </w:r>
-      <w:proofErr w:type="spellStart"/>
-      <w:r>
-        <w:rPr>
-          <w:rFonts w:ascii="Open Sans" w:eastAsia="Open Sans" w:hAnsi="Open Sans" w:cs="Open Sans"/>
-          <w:color w:val="2105FF"/>
-          <w:lang w:val="fr-FR"/>
-        </w:rPr>
-        <w:t>Commands</w:t>
-      </w:r>
-      <w:proofErr w:type="spellEnd"/>
-      <w:r>
-        <w:rPr>
-          <w:rFonts w:ascii="Open Sans" w:eastAsia="Open Sans" w:hAnsi="Open Sans" w:cs="Open Sans"/>
-          <w:color w:val="2105FF"/>
-          <w:lang w:val="fr-FR"/>
-        </w:rPr>
-        <w:t xml:space="preserve"> Documentation Template</w:t>
+        <w:t>Github Project: Git Commands Documentation Template</w:t>
       </w:r>
     </w:p>
     <w:p>
@@ -722,21 +694,7 @@
               <w:rPr>
                 <w:rFonts w:ascii="Open Sans" w:eastAsia="Open Sans" w:hAnsi="Open Sans" w:cs="Open Sans"/>
               </w:rPr>
-              <w:t>Create a .</w:t>
-            </w:r>
-            <w:proofErr w:type="spellStart"/>
-            <w:r>
-              <w:rPr>
-                <w:rFonts w:ascii="Open Sans" w:eastAsia="Open Sans" w:hAnsi="Open Sans" w:cs="Open Sans"/>
-              </w:rPr>
-              <w:t>gitignore</w:t>
-            </w:r>
-            <w:proofErr w:type="spellEnd"/>
-            <w:r>
-              <w:rPr>
-                <w:rFonts w:ascii="Open Sans" w:eastAsia="Open Sans" w:hAnsi="Open Sans" w:cs="Open Sans"/>
-              </w:rPr>
-              <w:t xml:space="preserve"> file containing the name of your data file.</w:t>
+              <w:t>Create a .gitignore file containing the name of your data file.</w:t>
             </w:r>
           </w:p>
         </w:tc>
@@ -761,16 +719,8 @@
               <w:rPr>
                 <w:rFonts w:ascii="Open Sans" w:eastAsia="Open Sans" w:hAnsi="Open Sans" w:cs="Open Sans"/>
               </w:rPr>
-              <w:t>echo "new_york_city.csv" &gt;&gt; .</w:t>
-            </w:r>
-            <w:proofErr w:type="spellStart"/>
-            <w:r>
-              <w:rPr>
-                <w:rFonts w:ascii="Open Sans" w:eastAsia="Open Sans" w:hAnsi="Open Sans" w:cs="Open Sans"/>
-              </w:rPr>
-              <w:t>gitignore</w:t>
-            </w:r>
-            <w:proofErr w:type="spellEnd"/>
+              <w:t>echo "new_york_city.csv" &gt;&gt; .gitignore</w:t>
+            </w:r>
           </w:p>
         </w:tc>
       </w:tr>
@@ -821,16 +771,8 @@
               <w:rPr>
                 <w:rFonts w:ascii="Open Sans" w:eastAsia="Open Sans" w:hAnsi="Open Sans" w:cs="Open Sans"/>
               </w:rPr>
-              <w:t>List the file names associated with the data files you added to your .</w:t>
-            </w:r>
-            <w:proofErr w:type="spellStart"/>
-            <w:r>
-              <w:rPr>
-                <w:rFonts w:ascii="Open Sans" w:eastAsia="Open Sans" w:hAnsi="Open Sans" w:cs="Open Sans"/>
-              </w:rPr>
-              <w:t>gitignore</w:t>
-            </w:r>
-            <w:proofErr w:type="spellEnd"/>
+              <w:t>List the file names associated with the data files you added to your .gitignore</w:t>
+            </w:r>
           </w:p>
         </w:tc>
         <w:tc>
@@ -854,16 +796,8 @@
               <w:rPr>
                 <w:rFonts w:ascii="Open Sans" w:eastAsia="Open Sans" w:hAnsi="Open Sans" w:cs="Open Sans"/>
               </w:rPr>
-              <w:t>cat .</w:t>
-            </w:r>
-            <w:proofErr w:type="spellStart"/>
-            <w:r>
-              <w:rPr>
-                <w:rFonts w:ascii="Open Sans" w:eastAsia="Open Sans" w:hAnsi="Open Sans" w:cs="Open Sans"/>
-              </w:rPr>
-              <w:t>gitignore</w:t>
-            </w:r>
-            <w:proofErr w:type="spellEnd"/>
+              <w:t>cat .gitignore</w:t>
+            </w:r>
           </w:p>
         </w:tc>
       </w:tr>
@@ -1091,21 +1025,7 @@
               <w:rPr>
                 <w:rFonts w:ascii="Open Sans" w:eastAsia="Open Sans" w:hAnsi="Open Sans" w:cs="Open Sans"/>
               </w:rPr>
-              <w:t xml:space="preserve">git commit -m "Add bikeshare analysis script and configure </w:t>
-            </w:r>
-            <w:proofErr w:type="spellStart"/>
-            <w:r>
-              <w:rPr>
-                <w:rFonts w:ascii="Open Sans" w:eastAsia="Open Sans" w:hAnsi="Open Sans" w:cs="Open Sans"/>
-              </w:rPr>
-              <w:t>gitignore</w:t>
-            </w:r>
-            <w:proofErr w:type="spellEnd"/>
-            <w:r>
-              <w:rPr>
-                <w:rFonts w:ascii="Open Sans" w:eastAsia="Open Sans" w:hAnsi="Open Sans" w:cs="Open Sans"/>
-              </w:rPr>
-              <w:t xml:space="preserve"> for data files"</w:t>
+              <w:t>git commit -m "Add bikeshare analysis script and configure gitignore for data files"</w:t>
             </w:r>
           </w:p>
         </w:tc>
@@ -1217,23 +1137,7 @@
           <w:rFonts w:ascii="Open Sans" w:eastAsia="Open Sans" w:hAnsi="Open Sans" w:cs="Open Sans"/>
           <w:b/>
         </w:rPr>
-        <w:t xml:space="preserve">Now you will be working in your local repository, on the </w:t>
-      </w:r>
-      <w:proofErr w:type="spellStart"/>
-      <w:r>
-        <w:rPr>
-          <w:rFonts w:ascii="Open Sans" w:eastAsia="Open Sans" w:hAnsi="Open Sans" w:cs="Open Sans"/>
-          <w:b/>
-        </w:rPr>
-        <w:t>BikeShare</w:t>
-      </w:r>
-      <w:proofErr w:type="spellEnd"/>
-      <w:r>
-        <w:rPr>
-          <w:rFonts w:ascii="Open Sans" w:eastAsia="Open Sans" w:hAnsi="Open Sans" w:cs="Open Sans"/>
-          <w:b/>
-        </w:rPr>
-        <w:t xml:space="preserve"> code file and the README.md file. You should repeat steps </w:t>
+        <w:t xml:space="preserve">Now you will be working in your local repository, on the BikeShare code file and the README.md file. You should repeat steps </w:t>
       </w:r>
       <w:r>
         <w:rPr>
@@ -1446,15 +1350,20 @@
             <w:r>
               <w:rPr>
                 <w:rFonts w:ascii="Open Sans" w:eastAsia="Open Sans" w:hAnsi="Open Sans" w:cs="Open Sans"/>
-                <w:i/>
-              </w:rPr>
-              <w:t>documentation</w:t>
-            </w:r>
-            <w:r>
-              <w:rPr>
-                <w:rFonts w:ascii="Open Sans" w:eastAsia="Open Sans" w:hAnsi="Open Sans" w:cs="Open Sans"/>
-              </w:rPr>
-              <w:t xml:space="preserve"> on your local repository.</w:t>
+              </w:rPr>
+              <w:t>new-git-project</w:t>
+            </w:r>
+            <w:r>
+              <w:rPr>
+                <w:rFonts w:ascii="Open Sans" w:eastAsia="Open Sans" w:hAnsi="Open Sans" w:cs="Open Sans"/>
+              </w:rPr>
+              <w:t xml:space="preserve"> </w:t>
+            </w:r>
+            <w:r>
+              <w:rPr>
+                <w:rFonts w:ascii="Open Sans" w:eastAsia="Open Sans" w:hAnsi="Open Sans" w:cs="Open Sans"/>
+              </w:rPr>
+              <w:t>on your local repository.</w:t>
             </w:r>
           </w:p>
         </w:tc>
@@ -1537,9 +1446,14 @@
             <w:r>
               <w:rPr>
                 <w:rFonts w:ascii="Open Sans" w:eastAsia="Open Sans" w:hAnsi="Open Sans" w:cs="Open Sans"/>
-                <w:i/>
-              </w:rPr>
-              <w:t xml:space="preserve">documentation </w:t>
+              </w:rPr>
+              <w:t>new-git-project</w:t>
+            </w:r>
+            <w:r>
+              <w:rPr>
+                <w:rFonts w:ascii="Open Sans" w:eastAsia="Open Sans" w:hAnsi="Open Sans" w:cs="Open Sans"/>
+              </w:rPr>
+              <w:t xml:space="preserve"> </w:t>
             </w:r>
             <w:r>
               <w:rPr>
@@ -2293,15 +2207,20 @@
             <w:r>
               <w:rPr>
                 <w:rFonts w:ascii="Open Sans" w:eastAsia="Open Sans" w:hAnsi="Open Sans" w:cs="Open Sans"/>
-                <w:i/>
-              </w:rPr>
-              <w:t>documentation</w:t>
-            </w:r>
-            <w:r>
-              <w:rPr>
-                <w:rFonts w:ascii="Open Sans" w:eastAsia="Open Sans" w:hAnsi="Open Sans" w:cs="Open Sans"/>
-              </w:rPr>
-              <w:t xml:space="preserve">  branch.</w:t>
+              </w:rPr>
+              <w:t>new-git-project</w:t>
+            </w:r>
+            <w:r>
+              <w:rPr>
+                <w:rFonts w:ascii="Open Sans" w:eastAsia="Open Sans" w:hAnsi="Open Sans" w:cs="Open Sans"/>
+              </w:rPr>
+              <w:t xml:space="preserve"> </w:t>
+            </w:r>
+            <w:r>
+              <w:rPr>
+                <w:rFonts w:ascii="Open Sans" w:eastAsia="Open Sans" w:hAnsi="Open Sans" w:cs="Open Sans"/>
+              </w:rPr>
+              <w:t>branch.</w:t>
             </w:r>
           </w:p>
         </w:tc>
@@ -2323,6 +2242,12 @@
                 <w:rFonts w:ascii="Open Sans" w:eastAsia="Open Sans" w:hAnsi="Open Sans" w:cs="Open Sans"/>
               </w:rPr>
             </w:pPr>
+            <w:r>
+              <w:rPr>
+                <w:rFonts w:ascii="Open Sans" w:eastAsia="Open Sans" w:hAnsi="Open Sans" w:cs="Open Sans"/>
+              </w:rPr>
+              <w:t>git checkout new-git-project</w:t>
+            </w:r>
           </w:p>
         </w:tc>
       </w:tr>
@@ -2397,6 +2322,18 @@
                 <w:rFonts w:ascii="Open Sans" w:eastAsia="Open Sans" w:hAnsi="Open Sans" w:cs="Open Sans"/>
               </w:rPr>
             </w:pPr>
+            <w:r>
+              <w:rPr>
+                <w:rFonts w:ascii="Open Sans" w:eastAsia="Open Sans" w:hAnsi="Open Sans" w:cs="Open Sans"/>
+              </w:rPr>
+              <w:t>git commit -m "Add inline comments</w:t>
+            </w:r>
+            <w:r>
+              <w:rPr>
+                <w:rFonts w:ascii="Open Sans" w:eastAsia="Open Sans" w:hAnsi="Open Sans" w:cs="Open Sans"/>
+              </w:rPr>
+              <w:t>”</w:t>
+            </w:r>
           </w:p>
         </w:tc>
       </w:tr>
@@ -2769,21 +2706,7 @@
               <w:rPr>
                 <w:rFonts w:ascii="Open Sans" w:eastAsia="Open Sans" w:hAnsi="Open Sans" w:cs="Open Sans"/>
               </w:rPr>
-              <w:t xml:space="preserve">Go to </w:t>
-            </w:r>
-            <w:proofErr w:type="spellStart"/>
-            <w:r>
-              <w:rPr>
-                <w:rFonts w:ascii="Open Sans" w:eastAsia="Open Sans" w:hAnsi="Open Sans" w:cs="Open Sans"/>
-              </w:rPr>
-              <w:t>Github</w:t>
-            </w:r>
-            <w:proofErr w:type="spellEnd"/>
-            <w:r>
-              <w:rPr>
-                <w:rFonts w:ascii="Open Sans" w:eastAsia="Open Sans" w:hAnsi="Open Sans" w:cs="Open Sans"/>
-              </w:rPr>
-              <w:t>.  Notice that you now have two branches available for your project, and when you change branches the README changes.</w:t>
+              <w:t>Go to Github.  Notice that you now have two branches available for your project, and when you change branches the README changes.</w:t>
             </w:r>
           </w:p>
         </w:tc>

</xml_diff>

<commit_message>
Refactor get_filters function to improve readability
</commit_message>
<xml_diff>
--- a/new-git-project/git-commands-documentation.docx
+++ b/new-git-project/git-commands-documentation.docx
@@ -13,13 +13,41 @@
       </w:pPr>
       <w:bookmarkStart w:id="0" w:name="_oe92ef9ki98r" w:colFirst="0" w:colLast="0"/>
       <w:bookmarkEnd w:id="0"/>
+      <w:proofErr w:type="spellStart"/>
       <w:r>
         <w:rPr>
           <w:rFonts w:ascii="Open Sans" w:eastAsia="Open Sans" w:hAnsi="Open Sans" w:cs="Open Sans"/>
           <w:color w:val="2105FF"/>
           <w:lang w:val="fr-FR"/>
         </w:rPr>
-        <w:t>Github Project: Git Commands Documentation Template</w:t>
+        <w:t>Github</w:t>
+      </w:r>
+      <w:proofErr w:type="spellEnd"/>
+      <w:r>
+        <w:rPr>
+          <w:rFonts w:ascii="Open Sans" w:eastAsia="Open Sans" w:hAnsi="Open Sans" w:cs="Open Sans"/>
+          <w:color w:val="2105FF"/>
+          <w:lang w:val="fr-FR"/>
+        </w:rPr>
+        <w:t xml:space="preserve"> Project: Git </w:t>
+      </w:r>
+      <w:proofErr w:type="spellStart"/>
+      <w:r>
+        <w:rPr>
+          <w:rFonts w:ascii="Open Sans" w:eastAsia="Open Sans" w:hAnsi="Open Sans" w:cs="Open Sans"/>
+          <w:color w:val="2105FF"/>
+          <w:lang w:val="fr-FR"/>
+        </w:rPr>
+        <w:t>Commands</w:t>
+      </w:r>
+      <w:proofErr w:type="spellEnd"/>
+      <w:r>
+        <w:rPr>
+          <w:rFonts w:ascii="Open Sans" w:eastAsia="Open Sans" w:hAnsi="Open Sans" w:cs="Open Sans"/>
+          <w:color w:val="2105FF"/>
+          <w:lang w:val="fr-FR"/>
+        </w:rPr>
+        <w:t xml:space="preserve"> Documentation Template</w:t>
       </w:r>
     </w:p>
     <w:p>
@@ -694,7 +722,21 @@
               <w:rPr>
                 <w:rFonts w:ascii="Open Sans" w:eastAsia="Open Sans" w:hAnsi="Open Sans" w:cs="Open Sans"/>
               </w:rPr>
-              <w:t>Create a .gitignore file containing the name of your data file.</w:t>
+              <w:t>Create a .</w:t>
+            </w:r>
+            <w:proofErr w:type="spellStart"/>
+            <w:r>
+              <w:rPr>
+                <w:rFonts w:ascii="Open Sans" w:eastAsia="Open Sans" w:hAnsi="Open Sans" w:cs="Open Sans"/>
+              </w:rPr>
+              <w:t>gitignore</w:t>
+            </w:r>
+            <w:proofErr w:type="spellEnd"/>
+            <w:r>
+              <w:rPr>
+                <w:rFonts w:ascii="Open Sans" w:eastAsia="Open Sans" w:hAnsi="Open Sans" w:cs="Open Sans"/>
+              </w:rPr>
+              <w:t xml:space="preserve"> file containing the name of your data file.</w:t>
             </w:r>
           </w:p>
         </w:tc>
@@ -719,8 +761,16 @@
               <w:rPr>
                 <w:rFonts w:ascii="Open Sans" w:eastAsia="Open Sans" w:hAnsi="Open Sans" w:cs="Open Sans"/>
               </w:rPr>
-              <w:t>echo "new_york_city.csv" &gt;&gt; .gitignore</w:t>
-            </w:r>
+              <w:t>echo "new_york_city.csv" &gt;&gt; .</w:t>
+            </w:r>
+            <w:proofErr w:type="spellStart"/>
+            <w:r>
+              <w:rPr>
+                <w:rFonts w:ascii="Open Sans" w:eastAsia="Open Sans" w:hAnsi="Open Sans" w:cs="Open Sans"/>
+              </w:rPr>
+              <w:t>gitignore</w:t>
+            </w:r>
+            <w:proofErr w:type="spellEnd"/>
           </w:p>
         </w:tc>
       </w:tr>
@@ -771,8 +821,16 @@
               <w:rPr>
                 <w:rFonts w:ascii="Open Sans" w:eastAsia="Open Sans" w:hAnsi="Open Sans" w:cs="Open Sans"/>
               </w:rPr>
-              <w:t>List the file names associated with the data files you added to your .gitignore</w:t>
-            </w:r>
+              <w:t>List the file names associated with the data files you added to your .</w:t>
+            </w:r>
+            <w:proofErr w:type="spellStart"/>
+            <w:r>
+              <w:rPr>
+                <w:rFonts w:ascii="Open Sans" w:eastAsia="Open Sans" w:hAnsi="Open Sans" w:cs="Open Sans"/>
+              </w:rPr>
+              <w:t>gitignore</w:t>
+            </w:r>
+            <w:proofErr w:type="spellEnd"/>
           </w:p>
         </w:tc>
         <w:tc>
@@ -796,8 +854,16 @@
               <w:rPr>
                 <w:rFonts w:ascii="Open Sans" w:eastAsia="Open Sans" w:hAnsi="Open Sans" w:cs="Open Sans"/>
               </w:rPr>
-              <w:t>cat .gitignore</w:t>
-            </w:r>
+              <w:t>cat .</w:t>
+            </w:r>
+            <w:proofErr w:type="spellStart"/>
+            <w:r>
+              <w:rPr>
+                <w:rFonts w:ascii="Open Sans" w:eastAsia="Open Sans" w:hAnsi="Open Sans" w:cs="Open Sans"/>
+              </w:rPr>
+              <w:t>gitignore</w:t>
+            </w:r>
+            <w:proofErr w:type="spellEnd"/>
           </w:p>
         </w:tc>
       </w:tr>
@@ -1025,7 +1091,21 @@
               <w:rPr>
                 <w:rFonts w:ascii="Open Sans" w:eastAsia="Open Sans" w:hAnsi="Open Sans" w:cs="Open Sans"/>
               </w:rPr>
-              <w:t>git commit -m "Add bikeshare analysis script and configure gitignore for data files"</w:t>
+              <w:t xml:space="preserve">git commit -m "Add bikeshare analysis script and configure </w:t>
+            </w:r>
+            <w:proofErr w:type="spellStart"/>
+            <w:r>
+              <w:rPr>
+                <w:rFonts w:ascii="Open Sans" w:eastAsia="Open Sans" w:hAnsi="Open Sans" w:cs="Open Sans"/>
+              </w:rPr>
+              <w:t>gitignore</w:t>
+            </w:r>
+            <w:proofErr w:type="spellEnd"/>
+            <w:r>
+              <w:rPr>
+                <w:rFonts w:ascii="Open Sans" w:eastAsia="Open Sans" w:hAnsi="Open Sans" w:cs="Open Sans"/>
+              </w:rPr>
+              <w:t xml:space="preserve"> for data files"</w:t>
             </w:r>
           </w:p>
         </w:tc>
@@ -1137,7 +1217,23 @@
           <w:rFonts w:ascii="Open Sans" w:eastAsia="Open Sans" w:hAnsi="Open Sans" w:cs="Open Sans"/>
           <w:b/>
         </w:rPr>
-        <w:t xml:space="preserve">Now you will be working in your local repository, on the BikeShare code file and the README.md file. You should repeat steps </w:t>
+        <w:t xml:space="preserve">Now you will be working in your local repository, on the </w:t>
+      </w:r>
+      <w:proofErr w:type="spellStart"/>
+      <w:r>
+        <w:rPr>
+          <w:rFonts w:ascii="Open Sans" w:eastAsia="Open Sans" w:hAnsi="Open Sans" w:cs="Open Sans"/>
+          <w:b/>
+        </w:rPr>
+        <w:t>BikeShare</w:t>
+      </w:r>
+      <w:proofErr w:type="spellEnd"/>
+      <w:r>
+        <w:rPr>
+          <w:rFonts w:ascii="Open Sans" w:eastAsia="Open Sans" w:hAnsi="Open Sans" w:cs="Open Sans"/>
+          <w:b/>
+        </w:rPr>
+        <w:t xml:space="preserve"> code file and the README.md file. You should repeat steps </w:t>
       </w:r>
       <w:r>
         <w:rPr>
@@ -2408,6 +2504,18 @@
                 <w:rFonts w:ascii="Open Sans" w:eastAsia="Open Sans" w:hAnsi="Open Sans" w:cs="Open Sans"/>
               </w:rPr>
             </w:pPr>
+            <w:r>
+              <w:rPr>
+                <w:rFonts w:ascii="Open Sans" w:eastAsia="Open Sans" w:hAnsi="Open Sans" w:cs="Open Sans"/>
+              </w:rPr>
+              <w:t>git commit -m "Add inline comments</w:t>
+            </w:r>
+            <w:r>
+              <w:rPr>
+                <w:rFonts w:ascii="Open Sans" w:eastAsia="Open Sans" w:hAnsi="Open Sans" w:cs="Open Sans"/>
+              </w:rPr>
+              <w:t>”</w:t>
+            </w:r>
           </w:p>
         </w:tc>
       </w:tr>
@@ -2482,6 +2590,12 @@
                 <w:rFonts w:ascii="Open Sans" w:eastAsia="Open Sans" w:hAnsi="Open Sans" w:cs="Open Sans"/>
               </w:rPr>
             </w:pPr>
+            <w:r>
+              <w:rPr>
+                <w:rFonts w:ascii="Open Sans" w:eastAsia="Open Sans" w:hAnsi="Open Sans" w:cs="Open Sans"/>
+              </w:rPr>
+              <w:t>git push origin new-git-project</w:t>
+            </w:r>
           </w:p>
         </w:tc>
       </w:tr>
@@ -2569,6 +2683,12 @@
                 <w:rFonts w:ascii="Open Sans" w:eastAsia="Open Sans" w:hAnsi="Open Sans" w:cs="Open Sans"/>
               </w:rPr>
             </w:pPr>
+            <w:r>
+              <w:rPr>
+                <w:rFonts w:ascii="Open Sans" w:eastAsia="Open Sans" w:hAnsi="Open Sans" w:cs="Open Sans"/>
+              </w:rPr>
+              <w:t>git checkout master</w:t>
+            </w:r>
           </w:p>
         </w:tc>
       </w:tr>
@@ -2650,9 +2770,32 @@
             <w:pPr>
               <w:rPr>
                 <w:rFonts w:ascii="Open Sans" w:eastAsia="Open Sans" w:hAnsi="Open Sans" w:cs="Open Sans"/>
-                <w:b/>
-              </w:rPr>
-            </w:pPr>
+                <w:bCs/>
+              </w:rPr>
+            </w:pPr>
+            <w:r>
+              <w:rPr>
+                <w:rFonts w:ascii="Open Sans" w:eastAsia="Open Sans" w:hAnsi="Open Sans" w:cs="Open Sans"/>
+                <w:bCs/>
+              </w:rPr>
+              <w:t>git log --</w:t>
+            </w:r>
+            <w:proofErr w:type="spellStart"/>
+            <w:r>
+              <w:rPr>
+                <w:rFonts w:ascii="Open Sans" w:eastAsia="Open Sans" w:hAnsi="Open Sans" w:cs="Open Sans"/>
+                <w:bCs/>
+              </w:rPr>
+              <w:t>oneline</w:t>
+            </w:r>
+            <w:proofErr w:type="spellEnd"/>
+            <w:r>
+              <w:rPr>
+                <w:rFonts w:ascii="Open Sans" w:eastAsia="Open Sans" w:hAnsi="Open Sans" w:cs="Open Sans"/>
+                <w:bCs/>
+              </w:rPr>
+              <w:t xml:space="preserve"> --graph --all</w:t>
+            </w:r>
           </w:p>
         </w:tc>
       </w:tr>
@@ -2706,7 +2849,21 @@
               <w:rPr>
                 <w:rFonts w:ascii="Open Sans" w:eastAsia="Open Sans" w:hAnsi="Open Sans" w:cs="Open Sans"/>
               </w:rPr>
-              <w:t>Go to Github.  Notice that you now have two branches available for your project, and when you change branches the README changes.</w:t>
+              <w:t xml:space="preserve">Go to </w:t>
+            </w:r>
+            <w:proofErr w:type="spellStart"/>
+            <w:r>
+              <w:rPr>
+                <w:rFonts w:ascii="Open Sans" w:eastAsia="Open Sans" w:hAnsi="Open Sans" w:cs="Open Sans"/>
+              </w:rPr>
+              <w:t>Github</w:t>
+            </w:r>
+            <w:proofErr w:type="spellEnd"/>
+            <w:r>
+              <w:rPr>
+                <w:rFonts w:ascii="Open Sans" w:eastAsia="Open Sans" w:hAnsi="Open Sans" w:cs="Open Sans"/>
+              </w:rPr>
+              <w:t>.  Notice that you now have two branches available for your project, and when you change branches the README changes.</w:t>
             </w:r>
           </w:p>
         </w:tc>
@@ -3037,6 +3194,12 @@
                 <w:rFonts w:ascii="Open Sans" w:eastAsia="Open Sans" w:hAnsi="Open Sans" w:cs="Open Sans"/>
               </w:rPr>
             </w:pPr>
+            <w:r>
+              <w:rPr>
+                <w:rFonts w:ascii="Open Sans" w:eastAsia="Open Sans" w:hAnsi="Open Sans" w:cs="Open Sans"/>
+              </w:rPr>
+              <w:t>git branch refactoring</w:t>
+            </w:r>
           </w:p>
         </w:tc>
       </w:tr>
@@ -3122,6 +3285,12 @@
                 <w:rFonts w:ascii="Open Sans" w:eastAsia="Open Sans" w:hAnsi="Open Sans" w:cs="Open Sans"/>
               </w:rPr>
             </w:pPr>
+            <w:r>
+              <w:rPr>
+                <w:rFonts w:ascii="Open Sans" w:eastAsia="Open Sans" w:hAnsi="Open Sans" w:cs="Open Sans"/>
+              </w:rPr>
+              <w:t>git checkout refactoring</w:t>
+            </w:r>
           </w:p>
         </w:tc>
       </w:tr>
@@ -3277,6 +3446,26 @@
                 <w:rFonts w:ascii="Open Sans" w:eastAsia="Open Sans" w:hAnsi="Open Sans" w:cs="Open Sans"/>
               </w:rPr>
             </w:pPr>
+            <w:r>
+              <w:rPr>
+                <w:rFonts w:ascii="Open Sans" w:eastAsia="Open Sans" w:hAnsi="Open Sans" w:cs="Open Sans"/>
+              </w:rPr>
+              <w:t xml:space="preserve">git commit -m "Refactor </w:t>
+            </w:r>
+            <w:proofErr w:type="spellStart"/>
+            <w:r>
+              <w:rPr>
+                <w:rFonts w:ascii="Open Sans" w:eastAsia="Open Sans" w:hAnsi="Open Sans" w:cs="Open Sans"/>
+              </w:rPr>
+              <w:t>get_filters</w:t>
+            </w:r>
+            <w:proofErr w:type="spellEnd"/>
+            <w:r>
+              <w:rPr>
+                <w:rFonts w:ascii="Open Sans" w:eastAsia="Open Sans" w:hAnsi="Open Sans" w:cs="Open Sans"/>
+              </w:rPr>
+              <w:t xml:space="preserve"> function to improve readability"</w:t>
+            </w:r>
           </w:p>
         </w:tc>
       </w:tr>

</xml_diff>

<commit_message>
Update git commands documentation
</commit_message>
<xml_diff>
--- a/new-git-project/git-commands-documentation.docx
+++ b/new-git-project/git-commands-documentation.docx
@@ -13,41 +13,13 @@
       </w:pPr>
       <w:bookmarkStart w:id="0" w:name="_oe92ef9ki98r" w:colFirst="0" w:colLast="0"/>
       <w:bookmarkEnd w:id="0"/>
-      <w:proofErr w:type="spellStart"/>
       <w:r>
         <w:rPr>
           <w:rFonts w:ascii="Open Sans" w:eastAsia="Open Sans" w:hAnsi="Open Sans" w:cs="Open Sans"/>
           <w:color w:val="2105FF"/>
           <w:lang w:val="fr-FR"/>
         </w:rPr>
-        <w:t>Github</w:t>
-      </w:r>
-      <w:proofErr w:type="spellEnd"/>
-      <w:r>
-        <w:rPr>
-          <w:rFonts w:ascii="Open Sans" w:eastAsia="Open Sans" w:hAnsi="Open Sans" w:cs="Open Sans"/>
-          <w:color w:val="2105FF"/>
-          <w:lang w:val="fr-FR"/>
-        </w:rPr>
-        <w:t xml:space="preserve"> Project: Git </w:t>
-      </w:r>
-      <w:proofErr w:type="spellStart"/>
-      <w:r>
-        <w:rPr>
-          <w:rFonts w:ascii="Open Sans" w:eastAsia="Open Sans" w:hAnsi="Open Sans" w:cs="Open Sans"/>
-          <w:color w:val="2105FF"/>
-          <w:lang w:val="fr-FR"/>
-        </w:rPr>
-        <w:t>Commands</w:t>
-      </w:r>
-      <w:proofErr w:type="spellEnd"/>
-      <w:r>
-        <w:rPr>
-          <w:rFonts w:ascii="Open Sans" w:eastAsia="Open Sans" w:hAnsi="Open Sans" w:cs="Open Sans"/>
-          <w:color w:val="2105FF"/>
-          <w:lang w:val="fr-FR"/>
-        </w:rPr>
-        <w:t xml:space="preserve"> Documentation Template</w:t>
+        <w:t>Github Project: Git Commands Documentation Template</w:t>
       </w:r>
     </w:p>
     <w:p>
@@ -722,21 +694,7 @@
               <w:rPr>
                 <w:rFonts w:ascii="Open Sans" w:eastAsia="Open Sans" w:hAnsi="Open Sans" w:cs="Open Sans"/>
               </w:rPr>
-              <w:t>Create a .</w:t>
-            </w:r>
-            <w:proofErr w:type="spellStart"/>
-            <w:r>
-              <w:rPr>
-                <w:rFonts w:ascii="Open Sans" w:eastAsia="Open Sans" w:hAnsi="Open Sans" w:cs="Open Sans"/>
-              </w:rPr>
-              <w:t>gitignore</w:t>
-            </w:r>
-            <w:proofErr w:type="spellEnd"/>
-            <w:r>
-              <w:rPr>
-                <w:rFonts w:ascii="Open Sans" w:eastAsia="Open Sans" w:hAnsi="Open Sans" w:cs="Open Sans"/>
-              </w:rPr>
-              <w:t xml:space="preserve"> file containing the name of your data file.</w:t>
+              <w:t>Create a .gitignore file containing the name of your data file.</w:t>
             </w:r>
           </w:p>
         </w:tc>
@@ -761,16 +719,8 @@
               <w:rPr>
                 <w:rFonts w:ascii="Open Sans" w:eastAsia="Open Sans" w:hAnsi="Open Sans" w:cs="Open Sans"/>
               </w:rPr>
-              <w:t>echo "new_york_city.csv" &gt;&gt; .</w:t>
-            </w:r>
-            <w:proofErr w:type="spellStart"/>
-            <w:r>
-              <w:rPr>
-                <w:rFonts w:ascii="Open Sans" w:eastAsia="Open Sans" w:hAnsi="Open Sans" w:cs="Open Sans"/>
-              </w:rPr>
-              <w:t>gitignore</w:t>
-            </w:r>
-            <w:proofErr w:type="spellEnd"/>
+              <w:t>echo "new_york_city.csv" &gt;&gt; .gitignore</w:t>
+            </w:r>
           </w:p>
         </w:tc>
       </w:tr>
@@ -821,16 +771,8 @@
               <w:rPr>
                 <w:rFonts w:ascii="Open Sans" w:eastAsia="Open Sans" w:hAnsi="Open Sans" w:cs="Open Sans"/>
               </w:rPr>
-              <w:t>List the file names associated with the data files you added to your .</w:t>
-            </w:r>
-            <w:proofErr w:type="spellStart"/>
-            <w:r>
-              <w:rPr>
-                <w:rFonts w:ascii="Open Sans" w:eastAsia="Open Sans" w:hAnsi="Open Sans" w:cs="Open Sans"/>
-              </w:rPr>
-              <w:t>gitignore</w:t>
-            </w:r>
-            <w:proofErr w:type="spellEnd"/>
+              <w:t>List the file names associated with the data files you added to your .gitignore</w:t>
+            </w:r>
           </w:p>
         </w:tc>
         <w:tc>
@@ -854,16 +796,8 @@
               <w:rPr>
                 <w:rFonts w:ascii="Open Sans" w:eastAsia="Open Sans" w:hAnsi="Open Sans" w:cs="Open Sans"/>
               </w:rPr>
-              <w:t>cat .</w:t>
-            </w:r>
-            <w:proofErr w:type="spellStart"/>
-            <w:r>
-              <w:rPr>
-                <w:rFonts w:ascii="Open Sans" w:eastAsia="Open Sans" w:hAnsi="Open Sans" w:cs="Open Sans"/>
-              </w:rPr>
-              <w:t>gitignore</w:t>
-            </w:r>
-            <w:proofErr w:type="spellEnd"/>
+              <w:t>cat .gitignore</w:t>
+            </w:r>
           </w:p>
         </w:tc>
       </w:tr>
@@ -1091,21 +1025,7 @@
               <w:rPr>
                 <w:rFonts w:ascii="Open Sans" w:eastAsia="Open Sans" w:hAnsi="Open Sans" w:cs="Open Sans"/>
               </w:rPr>
-              <w:t xml:space="preserve">git commit -m "Add bikeshare analysis script and configure </w:t>
-            </w:r>
-            <w:proofErr w:type="spellStart"/>
-            <w:r>
-              <w:rPr>
-                <w:rFonts w:ascii="Open Sans" w:eastAsia="Open Sans" w:hAnsi="Open Sans" w:cs="Open Sans"/>
-              </w:rPr>
-              <w:t>gitignore</w:t>
-            </w:r>
-            <w:proofErr w:type="spellEnd"/>
-            <w:r>
-              <w:rPr>
-                <w:rFonts w:ascii="Open Sans" w:eastAsia="Open Sans" w:hAnsi="Open Sans" w:cs="Open Sans"/>
-              </w:rPr>
-              <w:t xml:space="preserve"> for data files"</w:t>
+              <w:t>git commit -m "Add bikeshare analysis script and configure gitignore for data files"</w:t>
             </w:r>
           </w:p>
         </w:tc>
@@ -1217,23 +1137,7 @@
           <w:rFonts w:ascii="Open Sans" w:eastAsia="Open Sans" w:hAnsi="Open Sans" w:cs="Open Sans"/>
           <w:b/>
         </w:rPr>
-        <w:t xml:space="preserve">Now you will be working in your local repository, on the </w:t>
-      </w:r>
-      <w:proofErr w:type="spellStart"/>
-      <w:r>
-        <w:rPr>
-          <w:rFonts w:ascii="Open Sans" w:eastAsia="Open Sans" w:hAnsi="Open Sans" w:cs="Open Sans"/>
-          <w:b/>
-        </w:rPr>
-        <w:t>BikeShare</w:t>
-      </w:r>
-      <w:proofErr w:type="spellEnd"/>
-      <w:r>
-        <w:rPr>
-          <w:rFonts w:ascii="Open Sans" w:eastAsia="Open Sans" w:hAnsi="Open Sans" w:cs="Open Sans"/>
-          <w:b/>
-        </w:rPr>
-        <w:t xml:space="preserve"> code file and the README.md file. You should repeat steps </w:t>
+        <w:t xml:space="preserve">Now you will be working in your local repository, on the BikeShare code file and the README.md file. You should repeat steps </w:t>
       </w:r>
       <w:r>
         <w:rPr>
@@ -1447,7 +1351,7 @@
               <w:rPr>
                 <w:rFonts w:ascii="Open Sans" w:eastAsia="Open Sans" w:hAnsi="Open Sans" w:cs="Open Sans"/>
               </w:rPr>
-              <w:t>new-git-project</w:t>
+              <w:t>documentation</w:t>
             </w:r>
             <w:r>
               <w:rPr>
@@ -1485,7 +1389,13 @@
               <w:rPr>
                 <w:rFonts w:ascii="Open Sans" w:eastAsia="Open Sans" w:hAnsi="Open Sans" w:cs="Open Sans"/>
               </w:rPr>
-              <w:t>git branch new-git-project</w:t>
+              <w:t xml:space="preserve">git branch </w:t>
+            </w:r>
+            <w:r>
+              <w:rPr>
+                <w:rFonts w:ascii="Open Sans" w:eastAsia="Open Sans" w:hAnsi="Open Sans" w:cs="Open Sans"/>
+              </w:rPr>
+              <w:t>documentation</w:t>
             </w:r>
           </w:p>
         </w:tc>
@@ -1543,7 +1453,7 @@
               <w:rPr>
                 <w:rFonts w:ascii="Open Sans" w:eastAsia="Open Sans" w:hAnsi="Open Sans" w:cs="Open Sans"/>
               </w:rPr>
-              <w:t>new-git-project</w:t>
+              <w:t>documentation</w:t>
             </w:r>
             <w:r>
               <w:rPr>
@@ -1575,49 +1485,46 @@
               <w:spacing w:line="240" w:lineRule="auto"/>
               <w:rPr>
                 <w:rFonts w:ascii="Open Sans" w:eastAsia="Open Sans" w:hAnsi="Open Sans" w:cs="Open Sans"/>
-              </w:rPr>
-            </w:pPr>
-            <w:r>
-              <w:rPr>
-                <w:rFonts w:ascii="Open Sans" w:eastAsia="Open Sans" w:hAnsi="Open Sans" w:cs="Open Sans"/>
-              </w:rPr>
-              <w:t>git checkout</w:t>
-            </w:r>
-            <w:r>
-              <w:rPr>
-                <w:rFonts w:ascii="Open Sans" w:eastAsia="Open Sans" w:hAnsi="Open Sans" w:cs="Open Sans"/>
-              </w:rPr>
-              <w:t xml:space="preserve"> </w:t>
-            </w:r>
-            <w:r>
-              <w:rPr>
-                <w:rFonts w:ascii="Open Sans" w:eastAsia="Open Sans" w:hAnsi="Open Sans" w:cs="Open Sans"/>
-              </w:rPr>
-              <w:t>new-git-project</w:t>
-            </w:r>
-            <w:r>
-              <w:rPr>
-                <w:rFonts w:ascii="Open Sans" w:eastAsia="Open Sans" w:hAnsi="Open Sans" w:cs="Open Sans"/>
-              </w:rPr>
-              <w:br/>
-            </w:r>
-            <w:r>
-              <w:rPr>
-                <w:rFonts w:ascii="Open Sans" w:eastAsia="Open Sans" w:hAnsi="Open Sans" w:cs="Open Sans"/>
-              </w:rPr>
-              <w:t>git switch</w:t>
-            </w:r>
-            <w:r>
-              <w:rPr>
-                <w:rFonts w:ascii="Open Sans" w:eastAsia="Open Sans" w:hAnsi="Open Sans" w:cs="Open Sans"/>
-              </w:rPr>
-              <w:t xml:space="preserve"> </w:t>
-            </w:r>
-            <w:r>
-              <w:rPr>
-                <w:rFonts w:ascii="Open Sans" w:eastAsia="Open Sans" w:hAnsi="Open Sans" w:cs="Open Sans"/>
-              </w:rPr>
-              <w:t>new-git-project</w:t>
+                <w:lang w:val="fr-FR"/>
+              </w:rPr>
+            </w:pPr>
+            <w:r>
+              <w:rPr>
+                <w:rFonts w:ascii="Open Sans" w:eastAsia="Open Sans" w:hAnsi="Open Sans" w:cs="Open Sans"/>
+                <w:lang w:val="fr-FR"/>
+              </w:rPr>
+              <w:t xml:space="preserve">git checkout </w:t>
+            </w:r>
+            <w:r>
+              <w:rPr>
+                <w:rFonts w:ascii="Open Sans" w:eastAsia="Open Sans" w:hAnsi="Open Sans" w:cs="Open Sans"/>
+                <w:lang w:val="fr-FR"/>
+              </w:rPr>
+              <w:t>documentation</w:t>
+            </w:r>
+          </w:p>
+          <w:p>
+            <w:pPr>
+              <w:widowControl w:val="0"/>
+              <w:spacing w:line="240" w:lineRule="auto"/>
+              <w:rPr>
+                <w:rFonts w:ascii="Open Sans" w:eastAsia="Open Sans" w:hAnsi="Open Sans" w:cs="Open Sans"/>
+                <w:lang w:val="fr-FR"/>
+              </w:rPr>
+            </w:pPr>
+            <w:r>
+              <w:rPr>
+                <w:rFonts w:ascii="Open Sans" w:eastAsia="Open Sans" w:hAnsi="Open Sans" w:cs="Open Sans"/>
+                <w:lang w:val="fr-FR"/>
+              </w:rPr>
+              <w:t xml:space="preserve">git switch </w:t>
+            </w:r>
+            <w:r>
+              <w:rPr>
+                <w:rFonts w:ascii="Open Sans" w:eastAsia="Open Sans" w:hAnsi="Open Sans" w:cs="Open Sans"/>
+                <w:lang w:val="fr-FR"/>
+              </w:rPr>
+              <w:t>documentation</w:t>
             </w:r>
           </w:p>
         </w:tc>
@@ -2304,7 +2211,7 @@
               <w:rPr>
                 <w:rFonts w:ascii="Open Sans" w:eastAsia="Open Sans" w:hAnsi="Open Sans" w:cs="Open Sans"/>
               </w:rPr>
-              <w:t>new-git-project</w:t>
+              <w:t>documentation</w:t>
             </w:r>
             <w:r>
               <w:rPr>
@@ -2342,7 +2249,13 @@
               <w:rPr>
                 <w:rFonts w:ascii="Open Sans" w:eastAsia="Open Sans" w:hAnsi="Open Sans" w:cs="Open Sans"/>
               </w:rPr>
-              <w:t>git checkout new-git-project</w:t>
+              <w:t xml:space="preserve">git checkout </w:t>
+            </w:r>
+            <w:r>
+              <w:rPr>
+                <w:rFonts w:ascii="Open Sans" w:eastAsia="Open Sans" w:hAnsi="Open Sans" w:cs="Open Sans"/>
+              </w:rPr>
+              <w:t>documentation</w:t>
             </w:r>
           </w:p>
         </w:tc>
@@ -2594,7 +2507,13 @@
               <w:rPr>
                 <w:rFonts w:ascii="Open Sans" w:eastAsia="Open Sans" w:hAnsi="Open Sans" w:cs="Open Sans"/>
               </w:rPr>
-              <w:t>git push origin new-git-project</w:t>
+              <w:t xml:space="preserve">git push origin </w:t>
+            </w:r>
+            <w:r>
+              <w:rPr>
+                <w:rFonts w:ascii="Open Sans" w:eastAsia="Open Sans" w:hAnsi="Open Sans" w:cs="Open Sans"/>
+              </w:rPr>
+              <w:t>documentation</w:t>
             </w:r>
           </w:p>
         </w:tc>
@@ -2778,23 +2697,7 @@
                 <w:rFonts w:ascii="Open Sans" w:eastAsia="Open Sans" w:hAnsi="Open Sans" w:cs="Open Sans"/>
                 <w:bCs/>
               </w:rPr>
-              <w:t>git log --</w:t>
-            </w:r>
-            <w:proofErr w:type="spellStart"/>
-            <w:r>
-              <w:rPr>
-                <w:rFonts w:ascii="Open Sans" w:eastAsia="Open Sans" w:hAnsi="Open Sans" w:cs="Open Sans"/>
-                <w:bCs/>
-              </w:rPr>
-              <w:t>oneline</w:t>
-            </w:r>
-            <w:proofErr w:type="spellEnd"/>
-            <w:r>
-              <w:rPr>
-                <w:rFonts w:ascii="Open Sans" w:eastAsia="Open Sans" w:hAnsi="Open Sans" w:cs="Open Sans"/>
-                <w:bCs/>
-              </w:rPr>
-              <w:t xml:space="preserve"> --graph --all</w:t>
+              <w:t>git log --oneline --graph --all</w:t>
             </w:r>
           </w:p>
         </w:tc>
@@ -2849,21 +2752,7 @@
               <w:rPr>
                 <w:rFonts w:ascii="Open Sans" w:eastAsia="Open Sans" w:hAnsi="Open Sans" w:cs="Open Sans"/>
               </w:rPr>
-              <w:t xml:space="preserve">Go to </w:t>
-            </w:r>
-            <w:proofErr w:type="spellStart"/>
-            <w:r>
-              <w:rPr>
-                <w:rFonts w:ascii="Open Sans" w:eastAsia="Open Sans" w:hAnsi="Open Sans" w:cs="Open Sans"/>
-              </w:rPr>
-              <w:t>Github</w:t>
-            </w:r>
-            <w:proofErr w:type="spellEnd"/>
-            <w:r>
-              <w:rPr>
-                <w:rFonts w:ascii="Open Sans" w:eastAsia="Open Sans" w:hAnsi="Open Sans" w:cs="Open Sans"/>
-              </w:rPr>
-              <w:t>.  Notice that you now have two branches available for your project, and when you change branches the README changes.</w:t>
+              <w:t>Go to Github.  Notice that you now have two branches available for your project, and when you change branches the README changes.</w:t>
             </w:r>
           </w:p>
         </w:tc>
@@ -3450,21 +3339,7 @@
               <w:rPr>
                 <w:rFonts w:ascii="Open Sans" w:eastAsia="Open Sans" w:hAnsi="Open Sans" w:cs="Open Sans"/>
               </w:rPr>
-              <w:t xml:space="preserve">git commit -m "Refactor </w:t>
-            </w:r>
-            <w:proofErr w:type="spellStart"/>
-            <w:r>
-              <w:rPr>
-                <w:rFonts w:ascii="Open Sans" w:eastAsia="Open Sans" w:hAnsi="Open Sans" w:cs="Open Sans"/>
-              </w:rPr>
-              <w:t>get_filters</w:t>
-            </w:r>
-            <w:proofErr w:type="spellEnd"/>
-            <w:r>
-              <w:rPr>
-                <w:rFonts w:ascii="Open Sans" w:eastAsia="Open Sans" w:hAnsi="Open Sans" w:cs="Open Sans"/>
-              </w:rPr>
-              <w:t xml:space="preserve"> function to improve readability"</w:t>
+              <w:t>git commit -m "Refactor get_filters function to improve readability"</w:t>
             </w:r>
           </w:p>
         </w:tc>
@@ -3720,23 +3595,7 @@
                 <w:rFonts w:ascii="Open Sans" w:eastAsia="Open Sans" w:hAnsi="Open Sans" w:cs="Open Sans"/>
                 <w:bCs/>
               </w:rPr>
-              <w:t>git log --</w:t>
-            </w:r>
-            <w:proofErr w:type="spellStart"/>
-            <w:r>
-              <w:rPr>
-                <w:rFonts w:ascii="Open Sans" w:eastAsia="Open Sans" w:hAnsi="Open Sans" w:cs="Open Sans"/>
-                <w:bCs/>
-              </w:rPr>
-              <w:t>oneline</w:t>
-            </w:r>
-            <w:proofErr w:type="spellEnd"/>
-            <w:r>
-              <w:rPr>
-                <w:rFonts w:ascii="Open Sans" w:eastAsia="Open Sans" w:hAnsi="Open Sans" w:cs="Open Sans"/>
-                <w:bCs/>
-              </w:rPr>
-              <w:t xml:space="preserve"> --graph --all</w:t>
+              <w:t>git log --oneline --graph --all</w:t>
             </w:r>
           </w:p>
         </w:tc>
@@ -4277,17 +4136,8 @@
                 <w:rFonts w:ascii="Open Sans" w:eastAsia="Open Sans" w:hAnsi="Open Sans" w:cs="Open Sans"/>
                 <w:lang w:val="fr-FR"/>
               </w:rPr>
-              <w:t>git merge new-git-</w:t>
-            </w:r>
-            <w:proofErr w:type="spellStart"/>
-            <w:r>
-              <w:rPr>
-                <w:rFonts w:ascii="Open Sans" w:eastAsia="Open Sans" w:hAnsi="Open Sans" w:cs="Open Sans"/>
-                <w:lang w:val="fr-FR"/>
-              </w:rPr>
-              <w:t>project</w:t>
-            </w:r>
-            <w:proofErr w:type="spellEnd"/>
+              <w:t>git merge new-git-project</w:t>
+            </w:r>
           </w:p>
         </w:tc>
       </w:tr>

</xml_diff>

<commit_message>
docs: update git commands documentation
</commit_message>
<xml_diff>
--- a/new-git-project/git-commands-documentation.docx
+++ b/new-git-project/git-commands-documentation.docx
@@ -1923,7 +1923,13 @@
               <w:rPr>
                 <w:rFonts w:ascii="Open Sans" w:eastAsia="Open Sans" w:hAnsi="Open Sans" w:cs="Open Sans"/>
               </w:rPr>
-              <w:t>git switch master</w:t>
+              <w:t xml:space="preserve">git switch </w:t>
+            </w:r>
+            <w:r>
+              <w:rPr>
+                <w:rFonts w:ascii="Open Sans" w:eastAsia="Open Sans" w:hAnsi="Open Sans" w:cs="Open Sans"/>
+              </w:rPr>
+              <w:t>main</w:t>
             </w:r>
           </w:p>
         </w:tc>
@@ -2606,7 +2612,13 @@
               <w:rPr>
                 <w:rFonts w:ascii="Open Sans" w:eastAsia="Open Sans" w:hAnsi="Open Sans" w:cs="Open Sans"/>
               </w:rPr>
-              <w:t>git checkout master</w:t>
+              <w:t xml:space="preserve">git checkout </w:t>
+            </w:r>
+            <w:r>
+              <w:rPr>
+                <w:rFonts w:ascii="Open Sans" w:eastAsia="Open Sans" w:hAnsi="Open Sans" w:cs="Open Sans"/>
+              </w:rPr>
+              <w:t>main</w:t>
             </w:r>
           </w:p>
         </w:tc>
@@ -3504,7 +3516,13 @@
               <w:rPr>
                 <w:rFonts w:ascii="Open Sans" w:eastAsia="Open Sans" w:hAnsi="Open Sans" w:cs="Open Sans"/>
               </w:rPr>
-              <w:t>git checkout master</w:t>
+              <w:t xml:space="preserve">git checkout </w:t>
+            </w:r>
+            <w:r>
+              <w:rPr>
+                <w:rFonts w:ascii="Open Sans" w:eastAsia="Open Sans" w:hAnsi="Open Sans" w:cs="Open Sans"/>
+              </w:rPr>
+              <w:t>main</w:t>
             </w:r>
           </w:p>
         </w:tc>
@@ -3967,7 +3985,13 @@
               <w:rPr>
                 <w:rFonts w:ascii="Open Sans" w:eastAsia="Open Sans" w:hAnsi="Open Sans" w:cs="Open Sans"/>
               </w:rPr>
-              <w:t>git checkout master</w:t>
+              <w:t xml:space="preserve">git checkout </w:t>
+            </w:r>
+            <w:r>
+              <w:rPr>
+                <w:rFonts w:ascii="Open Sans" w:eastAsia="Open Sans" w:hAnsi="Open Sans" w:cs="Open Sans"/>
+              </w:rPr>
+              <w:t>main</w:t>
             </w:r>
           </w:p>
         </w:tc>
@@ -4043,7 +4067,13 @@
               <w:rPr>
                 <w:rFonts w:ascii="Open Sans" w:eastAsia="Open Sans" w:hAnsi="Open Sans" w:cs="Open Sans"/>
               </w:rPr>
-              <w:t>git pull origin master</w:t>
+              <w:t xml:space="preserve">git pull origin </w:t>
+            </w:r>
+            <w:r>
+              <w:rPr>
+                <w:rFonts w:ascii="Open Sans" w:eastAsia="Open Sans" w:hAnsi="Open Sans" w:cs="Open Sans"/>
+              </w:rPr>
+              <w:t>main</w:t>
             </w:r>
           </w:p>
         </w:tc>
@@ -4130,12 +4160,6 @@
                 <w:lang w:val="fr-FR"/>
               </w:rPr>
               <w:br/>
-            </w:r>
-            <w:r>
-              <w:rPr>
-                <w:rFonts w:ascii="Open Sans" w:eastAsia="Open Sans" w:hAnsi="Open Sans" w:cs="Open Sans"/>
-                <w:lang w:val="fr-FR"/>
-              </w:rPr>
               <w:t xml:space="preserve">git merge </w:t>
             </w:r>
             <w:r>
@@ -4297,7 +4321,13 @@
               <w:rPr>
                 <w:rFonts w:ascii="Open Sans" w:eastAsia="Open Sans" w:hAnsi="Open Sans" w:cs="Open Sans"/>
               </w:rPr>
-              <w:t>git push origin master</w:t>
+              <w:t xml:space="preserve">git push origin </w:t>
+            </w:r>
+            <w:r>
+              <w:rPr>
+                <w:rFonts w:ascii="Open Sans" w:eastAsia="Open Sans" w:hAnsi="Open Sans" w:cs="Open Sans"/>
+              </w:rPr>
+              <w:t>main</w:t>
             </w:r>
           </w:p>
         </w:tc>
@@ -5676,6 +5706,7 @@
   <w:style w:type="character" w:default="1" w:styleId="DefaultParagraphFont">
     <w:name w:val="Default Paragraph Font"/>
     <w:uiPriority w:val="1"/>
+    <w:semiHidden/>
     <w:unhideWhenUsed/>
   </w:style>
   <w:style w:type="table" w:default="1" w:styleId="TableNormal">

</xml_diff>